<commit_message>
docs: refresh Word statistics and SQL reports with live data
</commit_message>
<xml_diff>
--- a/Rapport_Resultats_Statistiques_ElMoultaka.docx
+++ b/Rapport_Resultats_Statistiques_ElMoultaka.docx
@@ -73,7 +73,7 @@
                 <w:sz w:val="20"/>
                 <w:szCs w:val="20"/>
               </w:rPr>
-              <w:t xml:space="preserve">Date d'extraction : 07/09/2026 12:44:35</w:t>
+              <w:t xml:space="preserve">Date d'extraction : 07/09/2026 14:57:03</w:t>
             </w:r>
           </w:p>
           <w:p>
@@ -4110,7 +4110,7 @@
                 <w:sz w:val="17"/>
                 <w:szCs w:val="17"/>
               </w:rPr>
-              <w:t xml:space="preserve">Administrateur Principal</w:t>
+              <w:t xml:space="preserve">Meriem Kirat</w:t>
             </w:r>
           </w:p>
         </w:tc>
@@ -5290,7 +5290,7 @@
                 <w:sz w:val="17"/>
                 <w:szCs w:val="17"/>
               </w:rPr>
-              <w:t xml:space="preserve">Administrateur Principal</w:t>
+              <w:t xml:space="preserve">Meriem Messaoudene</w:t>
             </w:r>
           </w:p>
         </w:tc>
@@ -5762,7 +5762,7 @@
                 <w:sz w:val="17"/>
                 <w:szCs w:val="17"/>
               </w:rPr>
-              <w:t xml:space="preserve">Administrateur Principal</w:t>
+              <w:t xml:space="preserve">Meriem Kirat</w:t>
             </w:r>
           </w:p>
         </w:tc>
@@ -6470,7 +6470,7 @@
                 <w:sz w:val="17"/>
                 <w:szCs w:val="17"/>
               </w:rPr>
-              <w:t xml:space="preserve">Administrateur Principal</w:t>
+              <w:t xml:space="preserve">Meriem Messaoudene</w:t>
             </w:r>
           </w:p>
         </w:tc>
@@ -7178,7 +7178,7 @@
                 <w:sz w:val="17"/>
                 <w:szCs w:val="17"/>
               </w:rPr>
-              <w:t xml:space="preserve">Administrateur Principal</w:t>
+              <w:t xml:space="preserve">Meriem Messaoudene</w:t>
             </w:r>
           </w:p>
         </w:tc>
@@ -7414,7 +7414,7 @@
                 <w:sz w:val="17"/>
                 <w:szCs w:val="17"/>
               </w:rPr>
-              <w:t xml:space="preserve">Administrateur Principal</w:t>
+              <w:t xml:space="preserve">Meriem Messaoudene</w:t>
             </w:r>
           </w:p>
         </w:tc>
@@ -7650,7 +7650,7 @@
                 <w:sz w:val="17"/>
                 <w:szCs w:val="17"/>
               </w:rPr>
-              <w:t xml:space="preserve">Administrateur Principal</w:t>
+              <w:t xml:space="preserve">Meriem Messaoudene</w:t>
             </w:r>
           </w:p>
         </w:tc>
@@ -7886,7 +7886,7 @@
                 <w:sz w:val="17"/>
                 <w:szCs w:val="17"/>
               </w:rPr>
-              <w:t xml:space="preserve">Administrateur Principal</w:t>
+              <w:t xml:space="preserve">Meriem Messaoudene</w:t>
             </w:r>
           </w:p>
         </w:tc>
@@ -8122,7 +8122,7 @@
                 <w:sz w:val="17"/>
                 <w:szCs w:val="17"/>
               </w:rPr>
-              <w:t xml:space="preserve">Administrateur Principal</w:t>
+              <w:t xml:space="preserve">Meriem Kirat</w:t>
             </w:r>
           </w:p>
         </w:tc>
@@ -8358,7 +8358,7 @@
                 <w:sz w:val="17"/>
                 <w:szCs w:val="17"/>
               </w:rPr>
-              <w:t xml:space="preserve">Administrateur Principal</w:t>
+              <w:t xml:space="preserve">Meriem Messaoudene</w:t>
             </w:r>
           </w:p>
         </w:tc>
@@ -17224,33 +17224,33 @@
                 <w:sz w:val="17"/>
                 <w:szCs w:val="17"/>
               </w:rPr>
-              <w:t xml:space="preserve">Administrateur Principal</w:t>
-            </w:r>
-          </w:p>
-        </w:tc>
-        <w:tc>
-          <w:tcPr>
-            <w:shd w:fill="FFFFFF" w:color="auto" w:val="clear"/>
-            <w:tcMar>
-              <w:top w:type="dxa" w:w="60"/>
-              <w:left w:type="dxa" w:w="80"/>
-              <w:bottom w:type="dxa" w:w="60"/>
-              <w:right w:type="dxa" w:w="80"/>
-            </w:tcMar>
-          </w:tcPr>
-          <w:p>
-            <w:pPr>
-              <w:jc w:val="left"/>
-            </w:pPr>
-            <w:r>
-              <w:rPr>
-                <w:b w:val="false"/>
-                <w:bCs w:val="false"/>
-                <w:color w:val="0F172A"/>
-                <w:sz w:val="17"/>
-                <w:szCs w:val="17"/>
-              </w:rPr>
-              <w:t xml:space="preserve">admin</w:t>
+              <w:t xml:space="preserve">Meriem Messaoudene</w:t>
+            </w:r>
+          </w:p>
+        </w:tc>
+        <w:tc>
+          <w:tcPr>
+            <w:shd w:fill="FFFFFF" w:color="auto" w:val="clear"/>
+            <w:tcMar>
+              <w:top w:type="dxa" w:w="60"/>
+              <w:left w:type="dxa" w:w="80"/>
+              <w:bottom w:type="dxa" w:w="60"/>
+              <w:right w:type="dxa" w:w="80"/>
+            </w:tcMar>
+          </w:tcPr>
+          <w:p>
+            <w:pPr>
+              <w:jc w:val="left"/>
+            </w:pPr>
+            <w:r>
+              <w:rPr>
+                <w:b w:val="false"/>
+                <w:bCs w:val="false"/>
+                <w:color w:val="0F172A"/>
+                <w:sz w:val="17"/>
+                <w:szCs w:val="17"/>
+              </w:rPr>
+              <w:t xml:space="preserve">me.messaoudene</w:t>
             </w:r>
           </w:p>
         </w:tc>
@@ -17276,7 +17276,7 @@
                 <w:sz w:val="17"/>
                 <w:szCs w:val="17"/>
               </w:rPr>
-              <w:t xml:space="preserve">10</w:t>
+              <w:t xml:space="preserve">8</w:t>
             </w:r>
           </w:p>
         </w:tc>
@@ -17302,7 +17302,7 @@
                 <w:sz w:val="17"/>
                 <w:szCs w:val="17"/>
               </w:rPr>
-              <w:t xml:space="preserve">10</w:t>
+              <w:t xml:space="preserve">8</w:t>
             </w:r>
           </w:p>
         </w:tc>
@@ -17354,7 +17354,7 @@
                 <w:sz w:val="17"/>
                 <w:szCs w:val="17"/>
               </w:rPr>
-              <w:t xml:space="preserve">939294</w:t>
+              <w:t xml:space="preserve">794239</w:t>
             </w:r>
           </w:p>
         </w:tc>
@@ -17406,7 +17406,7 @@
                 <w:sz w:val="17"/>
                 <w:szCs w:val="17"/>
               </w:rPr>
-              <w:t xml:space="preserve">16:03:33</w:t>
+              <w:t xml:space="preserve">16:18:08</w:t>
             </w:r>
           </w:p>
         </w:tc>
@@ -17644,33 +17644,33 @@
                 <w:sz w:val="17"/>
                 <w:szCs w:val="17"/>
               </w:rPr>
-              <w:t xml:space="preserve">Hadjer NEGGAR</w:t>
-            </w:r>
-          </w:p>
-        </w:tc>
-        <w:tc>
-          <w:tcPr>
-            <w:shd w:fill="FFFFFF" w:color="auto" w:val="clear"/>
-            <w:tcMar>
-              <w:top w:type="dxa" w:w="60"/>
-              <w:left w:type="dxa" w:w="80"/>
-              <w:bottom w:type="dxa" w:w="60"/>
-              <w:right w:type="dxa" w:w="80"/>
-            </w:tcMar>
-          </w:tcPr>
-          <w:p>
-            <w:pPr>
-              <w:jc w:val="left"/>
-            </w:pPr>
-            <w:r>
-              <w:rPr>
-                <w:b w:val="false"/>
-                <w:bCs w:val="false"/>
-                <w:color w:val="0F172A"/>
-                <w:sz w:val="17"/>
-                <w:szCs w:val="17"/>
-              </w:rPr>
-              <w:t xml:space="preserve">ha.neggar</w:t>
+              <w:t xml:space="preserve">Meriem Kirat</w:t>
+            </w:r>
+          </w:p>
+        </w:tc>
+        <w:tc>
+          <w:tcPr>
+            <w:shd w:fill="FFFFFF" w:color="auto" w:val="clear"/>
+            <w:tcMar>
+              <w:top w:type="dxa" w:w="60"/>
+              <w:left w:type="dxa" w:w="80"/>
+              <w:bottom w:type="dxa" w:w="60"/>
+              <w:right w:type="dxa" w:w="80"/>
+            </w:tcMar>
+          </w:tcPr>
+          <w:p>
+            <w:pPr>
+              <w:jc w:val="left"/>
+            </w:pPr>
+            <w:r>
+              <w:rPr>
+                <w:b w:val="false"/>
+                <w:bCs w:val="false"/>
+                <w:color w:val="0F172A"/>
+                <w:sz w:val="17"/>
+                <w:szCs w:val="17"/>
+              </w:rPr>
+              <w:t xml:space="preserve">me.kirat</w:t>
             </w:r>
           </w:p>
         </w:tc>
@@ -17696,6 +17696,32 @@
                 <w:sz w:val="17"/>
                 <w:szCs w:val="17"/>
               </w:rPr>
+              <w:t xml:space="preserve">6</w:t>
+            </w:r>
+          </w:p>
+        </w:tc>
+        <w:tc>
+          <w:tcPr>
+            <w:shd w:fill="FFFFFF" w:color="auto" w:val="clear"/>
+            <w:tcMar>
+              <w:top w:type="dxa" w:w="60"/>
+              <w:left w:type="dxa" w:w="80"/>
+              <w:bottom w:type="dxa" w:w="60"/>
+              <w:right w:type="dxa" w:w="80"/>
+            </w:tcMar>
+          </w:tcPr>
+          <w:p>
+            <w:pPr>
+              <w:jc w:val="center"/>
+            </w:pPr>
+            <w:r>
+              <w:rPr>
+                <w:b w:val="false"/>
+                <w:bCs w:val="false"/>
+                <w:color w:val="0F172A"/>
+                <w:sz w:val="17"/>
+                <w:szCs w:val="17"/>
+              </w:rPr>
               <w:t xml:space="preserve">4</w:t>
             </w:r>
           </w:p>
@@ -17722,7 +17748,33 @@
                 <w:sz w:val="17"/>
                 <w:szCs w:val="17"/>
               </w:rPr>
-              <w:t xml:space="preserve">4</w:t>
+              <w:t xml:space="preserve">2</w:t>
+            </w:r>
+          </w:p>
+        </w:tc>
+        <w:tc>
+          <w:tcPr>
+            <w:shd w:fill="FFFFFF" w:color="auto" w:val="clear"/>
+            <w:tcMar>
+              <w:top w:type="dxa" w:w="60"/>
+              <w:left w:type="dxa" w:w="80"/>
+              <w:bottom w:type="dxa" w:w="60"/>
+              <w:right w:type="dxa" w:w="80"/>
+            </w:tcMar>
+          </w:tcPr>
+          <w:p>
+            <w:pPr>
+              <w:jc w:val="right"/>
+            </w:pPr>
+            <w:r>
+              <w:rPr>
+                <w:b w:val="false"/>
+                <w:bCs w:val="false"/>
+                <w:color w:val="0F172A"/>
+                <w:sz w:val="17"/>
+                <w:szCs w:val="17"/>
+              </w:rPr>
+              <w:t xml:space="preserve">1526461</w:t>
             </w:r>
           </w:p>
         </w:tc>
@@ -17748,33 +17800,7 @@
                 <w:sz w:val="17"/>
                 <w:szCs w:val="17"/>
               </w:rPr>
-              <w:t xml:space="preserve">0</w:t>
-            </w:r>
-          </w:p>
-        </w:tc>
-        <w:tc>
-          <w:tcPr>
-            <w:shd w:fill="FFFFFF" w:color="auto" w:val="clear"/>
-            <w:tcMar>
-              <w:top w:type="dxa" w:w="60"/>
-              <w:left w:type="dxa" w:w="80"/>
-              <w:bottom w:type="dxa" w:w="60"/>
-              <w:right w:type="dxa" w:w="80"/>
-            </w:tcMar>
-          </w:tcPr>
-          <w:p>
-            <w:pPr>
-              <w:jc w:val="right"/>
-            </w:pPr>
-            <w:r>
-              <w:rPr>
-                <w:b w:val="false"/>
-                <w:bCs w:val="false"/>
-                <w:color w:val="0F172A"/>
-                <w:sz w:val="17"/>
-                <w:szCs w:val="17"/>
-              </w:rPr>
-              <w:t xml:space="preserve">168306</w:t>
+              <w:t xml:space="preserve">15:22:02</w:t>
             </w:r>
           </w:p>
         </w:tc>
@@ -17800,33 +17826,7 @@
                 <w:sz w:val="17"/>
                 <w:szCs w:val="17"/>
               </w:rPr>
-              <w:t xml:space="preserve">15:32:40</w:t>
-            </w:r>
-          </w:p>
-        </w:tc>
-        <w:tc>
-          <w:tcPr>
-            <w:shd w:fill="FFFFFF" w:color="auto" w:val="clear"/>
-            <w:tcMar>
-              <w:top w:type="dxa" w:w="60"/>
-              <w:left w:type="dxa" w:w="80"/>
-              <w:bottom w:type="dxa" w:w="60"/>
-              <w:right w:type="dxa" w:w="80"/>
-            </w:tcMar>
-          </w:tcPr>
-          <w:p>
-            <w:pPr>
-              <w:jc w:val="center"/>
-            </w:pPr>
-            <w:r>
-              <w:rPr>
-                <w:b w:val="false"/>
-                <w:bCs w:val="false"/>
-                <w:color w:val="0F172A"/>
-                <w:sz w:val="17"/>
-                <w:szCs w:val="17"/>
-              </w:rPr>
-              <w:t xml:space="preserve">16:39:46</w:t>
+              <w:t xml:space="preserve">16:21:52</w:t>
             </w:r>
           </w:p>
         </w:tc>
@@ -17854,33 +17854,33 @@
                 <w:sz w:val="17"/>
                 <w:szCs w:val="17"/>
               </w:rPr>
-              <w:t xml:space="preserve">Meriem Kirat</w:t>
-            </w:r>
-          </w:p>
-        </w:tc>
-        <w:tc>
-          <w:tcPr>
-            <w:shd w:fill="F8FAFC" w:color="auto" w:val="clear"/>
-            <w:tcMar>
-              <w:top w:type="dxa" w:w="60"/>
-              <w:left w:type="dxa" w:w="80"/>
-              <w:bottom w:type="dxa" w:w="60"/>
-              <w:right w:type="dxa" w:w="80"/>
-            </w:tcMar>
-          </w:tcPr>
-          <w:p>
-            <w:pPr>
-              <w:jc w:val="left"/>
-            </w:pPr>
-            <w:r>
-              <w:rPr>
-                <w:b w:val="false"/>
-                <w:bCs w:val="false"/>
-                <w:color w:val="0F172A"/>
-                <w:sz w:val="17"/>
-                <w:szCs w:val="17"/>
-              </w:rPr>
-              <w:t xml:space="preserve">me.kirat</w:t>
+              <w:t xml:space="preserve">Hadjer NEGGAR</w:t>
+            </w:r>
+          </w:p>
+        </w:tc>
+        <w:tc>
+          <w:tcPr>
+            <w:shd w:fill="F8FAFC" w:color="auto" w:val="clear"/>
+            <w:tcMar>
+              <w:top w:type="dxa" w:w="60"/>
+              <w:left w:type="dxa" w:w="80"/>
+              <w:bottom w:type="dxa" w:w="60"/>
+              <w:right w:type="dxa" w:w="80"/>
+            </w:tcMar>
+          </w:tcPr>
+          <w:p>
+            <w:pPr>
+              <w:jc w:val="left"/>
+            </w:pPr>
+            <w:r>
+              <w:rPr>
+                <w:b w:val="false"/>
+                <w:bCs w:val="false"/>
+                <w:color w:val="0F172A"/>
+                <w:sz w:val="17"/>
+                <w:szCs w:val="17"/>
+              </w:rPr>
+              <w:t xml:space="preserve">ha.neggar</w:t>
             </w:r>
           </w:p>
         </w:tc>
@@ -17906,7 +17906,7 @@
                 <w:sz w:val="17"/>
                 <w:szCs w:val="17"/>
               </w:rPr>
-              <w:t xml:space="preserve">3</w:t>
+              <w:t xml:space="preserve">4</w:t>
             </w:r>
           </w:p>
         </w:tc>
@@ -17932,7 +17932,7 @@
                 <w:sz w:val="17"/>
                 <w:szCs w:val="17"/>
               </w:rPr>
-              <w:t xml:space="preserve">1</w:t>
+              <w:t xml:space="preserve">4</w:t>
             </w:r>
           </w:p>
         </w:tc>
@@ -17958,7 +17958,7 @@
                 <w:sz w:val="17"/>
                 <w:szCs w:val="17"/>
               </w:rPr>
-              <w:t xml:space="preserve">2</w:t>
+              <w:t xml:space="preserve">0</w:t>
             </w:r>
           </w:p>
         </w:tc>
@@ -17984,7 +17984,7 @@
                 <w:sz w:val="17"/>
                 <w:szCs w:val="17"/>
               </w:rPr>
-              <w:t xml:space="preserve">1380996</w:t>
+              <w:t xml:space="preserve">168306</w:t>
             </w:r>
           </w:p>
         </w:tc>
@@ -18010,7 +18010,7 @@
                 <w:sz w:val="17"/>
                 <w:szCs w:val="17"/>
               </w:rPr>
-              <w:t xml:space="preserve">15:59:02</w:t>
+              <w:t xml:space="preserve">15:32:40</w:t>
             </w:r>
           </w:p>
         </w:tc>
@@ -18036,217 +18036,7 @@
                 <w:sz w:val="17"/>
                 <w:szCs w:val="17"/>
               </w:rPr>
-              <w:t xml:space="preserve">16:21:52</w:t>
-            </w:r>
-          </w:p>
-        </w:tc>
-      </w:tr>
-      <w:tr>
-        <w:tc>
-          <w:tcPr>
-            <w:shd w:fill="FFFFFF" w:color="auto" w:val="clear"/>
-            <w:tcMar>
-              <w:top w:type="dxa" w:w="60"/>
-              <w:left w:type="dxa" w:w="80"/>
-              <w:bottom w:type="dxa" w:w="60"/>
-              <w:right w:type="dxa" w:w="80"/>
-            </w:tcMar>
-          </w:tcPr>
-          <w:p>
-            <w:pPr>
-              <w:jc w:val="left"/>
-            </w:pPr>
-            <w:r>
-              <w:rPr>
-                <w:b/>
-                <w:bCs/>
-                <w:color w:val="0F172A"/>
-                <w:sz w:val="17"/>
-                <w:szCs w:val="17"/>
-              </w:rPr>
-              <w:t xml:space="preserve">Meriem Messaoudene</w:t>
-            </w:r>
-          </w:p>
-        </w:tc>
-        <w:tc>
-          <w:tcPr>
-            <w:shd w:fill="FFFFFF" w:color="auto" w:val="clear"/>
-            <w:tcMar>
-              <w:top w:type="dxa" w:w="60"/>
-              <w:left w:type="dxa" w:w="80"/>
-              <w:bottom w:type="dxa" w:w="60"/>
-              <w:right w:type="dxa" w:w="80"/>
-            </w:tcMar>
-          </w:tcPr>
-          <w:p>
-            <w:pPr>
-              <w:jc w:val="left"/>
-            </w:pPr>
-            <w:r>
-              <w:rPr>
-                <w:b w:val="false"/>
-                <w:bCs w:val="false"/>
-                <w:color w:val="0F172A"/>
-                <w:sz w:val="17"/>
-                <w:szCs w:val="17"/>
-              </w:rPr>
-              <w:t xml:space="preserve">me.messaoudene</w:t>
-            </w:r>
-          </w:p>
-        </w:tc>
-        <w:tc>
-          <w:tcPr>
-            <w:shd w:fill="FFFFFF" w:color="auto" w:val="clear"/>
-            <w:tcMar>
-              <w:top w:type="dxa" w:w="60"/>
-              <w:left w:type="dxa" w:w="80"/>
-              <w:bottom w:type="dxa" w:w="60"/>
-              <w:right w:type="dxa" w:w="80"/>
-            </w:tcMar>
-          </w:tcPr>
-          <w:p>
-            <w:pPr>
-              <w:jc w:val="center"/>
-            </w:pPr>
-            <w:r>
-              <w:rPr>
-                <w:b/>
-                <w:bCs/>
-                <w:color w:val="0F172A"/>
-                <w:sz w:val="17"/>
-                <w:szCs w:val="17"/>
-              </w:rPr>
-              <w:t xml:space="preserve">1</w:t>
-            </w:r>
-          </w:p>
-        </w:tc>
-        <w:tc>
-          <w:tcPr>
-            <w:shd w:fill="FFFFFF" w:color="auto" w:val="clear"/>
-            <w:tcMar>
-              <w:top w:type="dxa" w:w="60"/>
-              <w:left w:type="dxa" w:w="80"/>
-              <w:bottom w:type="dxa" w:w="60"/>
-              <w:right w:type="dxa" w:w="80"/>
-            </w:tcMar>
-          </w:tcPr>
-          <w:p>
-            <w:pPr>
-              <w:jc w:val="center"/>
-            </w:pPr>
-            <w:r>
-              <w:rPr>
-                <w:b w:val="false"/>
-                <w:bCs w:val="false"/>
-                <w:color w:val="0F172A"/>
-                <w:sz w:val="17"/>
-                <w:szCs w:val="17"/>
-              </w:rPr>
-              <w:t xml:space="preserve">1</w:t>
-            </w:r>
-          </w:p>
-        </w:tc>
-        <w:tc>
-          <w:tcPr>
-            <w:shd w:fill="FFFFFF" w:color="auto" w:val="clear"/>
-            <w:tcMar>
-              <w:top w:type="dxa" w:w="60"/>
-              <w:left w:type="dxa" w:w="80"/>
-              <w:bottom w:type="dxa" w:w="60"/>
-              <w:right w:type="dxa" w:w="80"/>
-            </w:tcMar>
-          </w:tcPr>
-          <w:p>
-            <w:pPr>
-              <w:jc w:val="center"/>
-            </w:pPr>
-            <w:r>
-              <w:rPr>
-                <w:b w:val="false"/>
-                <w:bCs w:val="false"/>
-                <w:color w:val="0F172A"/>
-                <w:sz w:val="17"/>
-                <w:szCs w:val="17"/>
-              </w:rPr>
-              <w:t xml:space="preserve">0</w:t>
-            </w:r>
-          </w:p>
-        </w:tc>
-        <w:tc>
-          <w:tcPr>
-            <w:shd w:fill="FFFFFF" w:color="auto" w:val="clear"/>
-            <w:tcMar>
-              <w:top w:type="dxa" w:w="60"/>
-              <w:left w:type="dxa" w:w="80"/>
-              <w:bottom w:type="dxa" w:w="60"/>
-              <w:right w:type="dxa" w:w="80"/>
-            </w:tcMar>
-          </w:tcPr>
-          <w:p>
-            <w:pPr>
-              <w:jc w:val="right"/>
-            </w:pPr>
-            <w:r>
-              <w:rPr>
-                <w:b w:val="false"/>
-                <w:bCs w:val="false"/>
-                <w:color w:val="0F172A"/>
-                <w:sz w:val="17"/>
-                <w:szCs w:val="17"/>
-              </w:rPr>
-              <w:t xml:space="preserve">410</w:t>
-            </w:r>
-          </w:p>
-        </w:tc>
-        <w:tc>
-          <w:tcPr>
-            <w:shd w:fill="FFFFFF" w:color="auto" w:val="clear"/>
-            <w:tcMar>
-              <w:top w:type="dxa" w:w="60"/>
-              <w:left w:type="dxa" w:w="80"/>
-              <w:bottom w:type="dxa" w:w="60"/>
-              <w:right w:type="dxa" w:w="80"/>
-            </w:tcMar>
-          </w:tcPr>
-          <w:p>
-            <w:pPr>
-              <w:jc w:val="center"/>
-            </w:pPr>
-            <w:r>
-              <w:rPr>
-                <w:b w:val="false"/>
-                <w:bCs w:val="false"/>
-                <w:color w:val="0F172A"/>
-                <w:sz w:val="17"/>
-                <w:szCs w:val="17"/>
-              </w:rPr>
-              <w:t xml:space="preserve">16:18:08</w:t>
-            </w:r>
-          </w:p>
-        </w:tc>
-        <w:tc>
-          <w:tcPr>
-            <w:shd w:fill="FFFFFF" w:color="auto" w:val="clear"/>
-            <w:tcMar>
-              <w:top w:type="dxa" w:w="60"/>
-              <w:left w:type="dxa" w:w="80"/>
-              <w:bottom w:type="dxa" w:w="60"/>
-              <w:right w:type="dxa" w:w="80"/>
-            </w:tcMar>
-          </w:tcPr>
-          <w:p>
-            <w:pPr>
-              <w:jc w:val="center"/>
-            </w:pPr>
-            <w:r>
-              <w:rPr>
-                <w:b w:val="false"/>
-                <w:bCs w:val="false"/>
-                <w:color w:val="0F172A"/>
-                <w:sz w:val="17"/>
-                <w:szCs w:val="17"/>
-              </w:rPr>
-              <w:t xml:space="preserve">16:18:08</w:t>
+              <w:t xml:space="preserve">16:39:46</w:t>
             </w:r>
           </w:p>
         </w:tc>

</xml_diff>